<commit_message>
KO updating with added files not yet organized fully
</commit_message>
<xml_diff>
--- a/collection/HBOT Treatment Decision KO/UHMS_Figure_6_DFU_HBO2_Algorithm_CKS_Version_1_0.docx
+++ b/collection/HBOT Treatment Decision KO/UHMS_Figure_6_DFU_HBO2_Algorithm_CKS_Version_1_0.docx
@@ -9900,6 +9900,174 @@
           <w:docGrid w:linePitch="360"/>
         </w:sectPr>
       </w:pPr>
+    </w:p>
+    <w:p>
+      <w:pPr>
+        <w:pStyle w:val="Heading1"/>
+        <w:keepNext/>
+      </w:pPr>
+      <w:r>
+        <w:t>10. Version 1.0 Interoperability Amendment</w:t>
+      </w:r>
+    </w:p>
+    <w:p>
+      <w:pPr>
+        <w:keepNext w:val="0"/>
+      </w:pPr>
+      <w:r>
+        <w:t>This normative amendment is part of CKS Version 1.0. It publishes separately addressable representation profiles for the existing runtime contracts. It SHALL NOT change the clinical scope, decision branches, input meanings, Wagner-grade rules, validation precedence, result identifiers, result text, evidence-quality mappings, recommendation-strength mappings, test-vector behavior, or implementation output specified elsewhere in this CKS.</w:t>
+      </w:r>
+    </w:p>
+    <w:p>
+      <w:pPr>
+        <w:pStyle w:val="Heading2"/>
+        <w:keepNext/>
+      </w:pPr>
+      <w:r>
+        <w:t>10.1 Profiled Object-Level Invocation Boundary</w:t>
+      </w:r>
+    </w:p>
+    <w:p>
+      <w:pPr>
+        <w:keepNext w:val="0"/>
+      </w:pPr>
+      <w:r>
+        <w:t>The normative object-level interoperability boundary for the JavaScript realization is the exported function evaluateInputObject, identified by urn:javascript:function:evaluateInputObject. evaluateInputObject accepts the native complete input object specified by Section 3 and returns the complete unified result object specified by Sections 5 and 6.</w:t>
+      </w:r>
+    </w:p>
+    <w:p>
+      <w:pPr>
+        <w:keepNext w:val="0"/>
+      </w:pPr>
+      <w:r>
+        <w:t>evaluateSerializedInput is a serialized-text adapter with additional parsing and duplicate-property responsibilities under Sections 3.5.1, 3.5.2, and 3.7. evaluateFixture is a testing interface. Command-line invocation modes are presentation adapters. The representation profiles assigned by this amendment apply specifically to evaluateInputObject.</w:t>
+      </w:r>
+    </w:p>
+    <w:p>
+      <w:pPr>
+        <w:pStyle w:val="Heading2"/>
+        <w:keepNext/>
+      </w:pPr>
+      <w:r>
+        <w:t>10.2 Semantic-Model Identifiers</w:t>
+      </w:r>
+    </w:p>
+    <w:p>
+      <w:pPr>
+        <w:keepNext w:val="0"/>
+      </w:pPr>
+      <w:r>
+        <w:t>The input semantic model is identified by https://kgrid.org/cks/dfu-hbo2-treatment-decision/versions/1.0/input-model.</w:t>
+      </w:r>
+    </w:p>
+    <w:p>
+      <w:pPr>
+        <w:keepNext w:val="0"/>
+      </w:pPr>
+      <w:r>
+        <w:t>The unified result semantic model is identified by https://kgrid.org/cks/dfu-hbo2-treatment-decision/output-models/1.0.</w:t>
+      </w:r>
+    </w:p>
+    <w:p>
+      <w:pPr>
+        <w:pStyle w:val="Heading2"/>
+        <w:keepNext/>
+      </w:pPr>
+      <w:r>
+        <w:t>10.3 Runtime Representation Profiles</w:t>
+      </w:r>
+    </w:p>
+    <w:p>
+      <w:pPr>
+        <w:keepNext w:val="0"/>
+      </w:pPr>
+      <w:r>
+        <w:t>The normative runtime JSON Schema bundle is DFU_HBO2_Treatment_Decision_Schema_Bundle_1_0.json. It uses JSON Schema Draft 7 and is identified by https://kgrid.org/cks/dfu-hbo2-treatment-decision/schema-bundles/versions/1.0.</w:t>
+      </w:r>
+    </w:p>
+    <w:p>
+      <w:pPr>
+        <w:pStyle w:val="ListBullet"/>
+        <w:keepNext w:val="0"/>
+      </w:pPr>
+      <w:r>
+        <w:t>The complete invocation-input profile is identified by https://kgrid.org/cks/dfu-hbo2-treatment-decision/schema-bundles/versions/1.0#input.</w:t>
+      </w:r>
+    </w:p>
+    <w:p>
+      <w:pPr>
+        <w:pStyle w:val="ListBullet"/>
+        <w:keepNext w:val="0"/>
+      </w:pPr>
+      <w:r>
+        <w:t>The complete unified-result profile is identified by https://kgrid.org/cks/dfu-hbo2-treatment-decision/schema-bundles/versions/1.0#result.</w:t>
+      </w:r>
+    </w:p>
+    <w:p>
+      <w:pPr>
+        <w:keepNext w:val="0"/>
+      </w:pPr>
+      <w:r>
+        <w:t>The semantic-model IRIs identify the meaning of accepted input and produced output. The schema-fragment IRIs identify complete representations exchanged at the profiled invocation boundary. These identifier roles are distinct and SHALL NOT be treated as interchangeable.</w:t>
+      </w:r>
+    </w:p>
+    <w:p>
+      <w:pPr>
+        <w:keepNext w:val="0"/>
+      </w:pPr>
+      <w:r>
+        <w:t>The runtime input and result profiles are distinct from the schema governing the canonical test-vector artifact. The test-vector schema describes the test suite, its fixtures, governing identifiers, and coverage matrix; it SHALL NOT be reused or cited as the runtime invocation-input or result profile.</w:t>
+      </w:r>
+    </w:p>
+    <w:p>
+      <w:pPr>
+        <w:keepNext w:val="0"/>
+      </w:pPr>
+      <w:r>
+        <w:t>The input profile requires all four fields, preserves their exact types and closed value sets, permits unknown properties because Section 3.5 requires them to be ignored, and performs no coercion. The result profile covers every completed, OUT-OF-SCOPE, and validation-error object returnable by evaluateInputObject and closes each exact nine-field mapping. ERR-06 belongs to the serialized-text adapter path and is not returnable from a native unique-name JavaScript object presented to evaluateInputObject.</w:t>
+      </w:r>
+    </w:p>
+    <w:p>
+      <w:pPr>
+        <w:pStyle w:val="Heading2"/>
+        <w:keepNext/>
+      </w:pPr>
+      <w:r>
+        <w:t>10.4 Conformance Requirements</w:t>
+      </w:r>
+    </w:p>
+    <w:p>
+      <w:pPr>
+        <w:keepNext w:val="0"/>
+      </w:pPr>
+      <w:r>
+        <w:t>A conformance test for this profiled boundary SHALL demonstrate that every valid canonical native-object invocation input validates against #input; every applicable canonical invalid native input is handled consistently with this CKS; and every object returned by evaluateInputObject validates against #result. Coverage SHALL include completed, OUT-OF-SCOPE, and error results.</w:t>
+      </w:r>
+    </w:p>
+    <w:p>
+      <w:pPr>
+        <w:keepNext w:val="0"/>
+      </w:pPr>
+      <w:r>
+        <w:t>The canonical test-vector artifact SHALL continue to validate against its own Version 1.0 test-vector schema. Runtime-schema and test-vector-schema identifiers and artifacts SHALL remain separate. All existing behavioral tests SHALL continue to pass unchanged.</w:t>
+      </w:r>
+    </w:p>
+    <w:p>
+      <w:pPr>
+        <w:pStyle w:val="Heading2"/>
+        <w:keepNext/>
+      </w:pPr>
+      <w:r>
+        <w:t>10.5 Versioning Rationale</w:t>
+      </w:r>
+    </w:p>
+    <w:p>
+      <w:pPr>
+        <w:keepNext w:val="0"/>
+      </w:pPr>
+      <w:r>
+        <w:t>This amendment remains Version 1.0 because it is a non-behavioral clarification and publication of contracts already normatively defined by Sections 3, 5, 6, 9, and Appendix B and already implemented and exercised by the canonical test vectors. It assigns stable identifiers to those existing runtime representations and identifies the existing exported object-level function. It introduces no new clinical or computational behavior and therefore does not require or imply a successor specification version.</w:t>
+      </w:r>
     </w:p>
     <w:p>
       <w:pPr>

</xml_diff>